<commit_message>
added intro to models
</commit_message>
<xml_diff>
--- a/Week_13/output/table.docx
+++ b/Week_13/output/table.docx
@@ -31,7 +31,6 @@
           <w:p>
             <w:pPr>
               <w:pStyle w:val="Compact"/>
-              <w:jc w:val="left"/>
             </w:pPr>
             <w:r>
               <w:t xml:space="preserve">Model with interaction</w:t>
@@ -43,7 +42,6 @@
           <w:p>
             <w:pPr>
               <w:pStyle w:val="Compact"/>
-              <w:jc w:val="left"/>
             </w:pPr>
             <w:r>
               <w:t xml:space="preserve">Model with no interaction</w:t>
@@ -57,7 +55,6 @@
           <w:p>
             <w:pPr>
               <w:pStyle w:val="Compact"/>
-              <w:jc w:val="left"/>
             </w:pPr>
             <w:r>
               <w:t xml:space="preserve">(Intercept)</w:t>
@@ -69,7 +66,6 @@
           <w:p>
             <w:pPr>
               <w:pStyle w:val="Compact"/>
-              <w:jc w:val="left"/>
             </w:pPr>
             <w:r>
               <w:t xml:space="preserve">23.068</w:t>
@@ -81,7 +77,6 @@
           <w:p>
             <w:pPr>
               <w:pStyle w:val="Compact"/>
-              <w:jc w:val="left"/>
             </w:pPr>
             <w:r>
               <w:t xml:space="preserve">55.067</w:t>
@@ -103,7 +98,6 @@
           <w:p>
             <w:pPr>
               <w:pStyle w:val="Compact"/>
-              <w:jc w:val="left"/>
             </w:pPr>
             <w:r>
               <w:t xml:space="preserve">(3.017)</w:t>
@@ -115,7 +109,6 @@
           <w:p>
             <w:pPr>
               <w:pStyle w:val="Compact"/>
-              <w:jc w:val="left"/>
             </w:pPr>
             <w:r>
               <w:t xml:space="preserve">(2.516)</w:t>
@@ -129,7 +122,6 @@
           <w:p>
             <w:pPr>
               <w:pStyle w:val="Compact"/>
-              <w:jc w:val="left"/>
             </w:pPr>
             <w:r>
               <w:t xml:space="preserve">bill_depth_mm</w:t>
@@ -141,7 +133,6 @@
           <w:p>
             <w:pPr>
               <w:pStyle w:val="Compact"/>
-              <w:jc w:val="left"/>
             </w:pPr>
             <w:r>
               <w:t xml:space="preserve">0.857</w:t>
@@ -153,7 +144,6 @@
           <w:p>
             <w:pPr>
               <w:pStyle w:val="Compact"/>
-              <w:jc w:val="left"/>
             </w:pPr>
             <w:r>
               <w:t xml:space="preserve">-0.650</w:t>
@@ -175,7 +165,6 @@
           <w:p>
             <w:pPr>
               <w:pStyle w:val="Compact"/>
-              <w:jc w:val="left"/>
             </w:pPr>
             <w:r>
               <w:t xml:space="preserve">(0.164)</w:t>
@@ -187,7 +176,6 @@
           <w:p>
             <w:pPr>
               <w:pStyle w:val="Compact"/>
-              <w:jc w:val="left"/>
             </w:pPr>
             <w:r>
               <w:t xml:space="preserve">(0.146)</w:t>
@@ -201,7 +189,6 @@
           <w:p>
             <w:pPr>
               <w:pStyle w:val="Compact"/>
-              <w:jc w:val="left"/>
             </w:pPr>
             <w:r>
               <w:t xml:space="preserve">speciesChinstrap</w:t>
@@ -213,7 +200,6 @@
           <w:p>
             <w:pPr>
               <w:pStyle w:val="Compact"/>
-              <w:jc w:val="left"/>
             </w:pPr>
             <w:r>
               <w:t xml:space="preserve">-9.640</w:t>
@@ -243,7 +229,6 @@
           <w:p>
             <w:pPr>
               <w:pStyle w:val="Compact"/>
-              <w:jc w:val="left"/>
             </w:pPr>
             <w:r>
               <w:t xml:space="preserve">(5.715)</w:t>
@@ -265,7 +250,6 @@
           <w:p>
             <w:pPr>
               <w:pStyle w:val="Compact"/>
-              <w:jc w:val="left"/>
             </w:pPr>
             <w:r>
               <w:t xml:space="preserve">speciesGentoo</w:t>
@@ -277,7 +261,6 @@
           <w:p>
             <w:pPr>
               <w:pStyle w:val="Compact"/>
-              <w:jc w:val="left"/>
             </w:pPr>
             <w:r>
               <w:t xml:space="preserve">-5.839</w:t>
@@ -307,7 +290,6 @@
           <w:p>
             <w:pPr>
               <w:pStyle w:val="Compact"/>
-              <w:jc w:val="left"/>
             </w:pPr>
             <w:r>
               <w:t xml:space="preserve">(4.535)</w:t>
@@ -329,7 +311,6 @@
           <w:p>
             <w:pPr>
               <w:pStyle w:val="Compact"/>
-              <w:jc w:val="left"/>
             </w:pPr>
             <w:r>
               <w:t xml:space="preserve">bill_depth_mm × speciesChinstrap</w:t>
@@ -341,7 +322,6 @@
           <w:p>
             <w:pPr>
               <w:pStyle w:val="Compact"/>
-              <w:jc w:val="left"/>
             </w:pPr>
             <w:r>
               <w:t xml:space="preserve">1.065</w:t>
@@ -371,7 +351,6 @@
           <w:p>
             <w:pPr>
               <w:pStyle w:val="Compact"/>
-              <w:jc w:val="left"/>
             </w:pPr>
             <w:r>
               <w:t xml:space="preserve">(0.310)</w:t>
@@ -393,7 +372,6 @@
           <w:p>
             <w:pPr>
               <w:pStyle w:val="Compact"/>
-              <w:jc w:val="left"/>
             </w:pPr>
             <w:r>
               <w:t xml:space="preserve">bill_depth_mm × speciesGentoo</w:t>
@@ -405,7 +383,6 @@
           <w:p>
             <w:pPr>
               <w:pStyle w:val="Compact"/>
-              <w:jc w:val="left"/>
             </w:pPr>
             <w:r>
               <w:t xml:space="preserve">1.164</w:t>
@@ -435,7 +412,6 @@
           <w:p>
             <w:pPr>
               <w:pStyle w:val="Compact"/>
-              <w:jc w:val="left"/>
             </w:pPr>
             <w:r>
               <w:t xml:space="preserve">(0.279)</w:t>
@@ -457,7 +433,6 @@
           <w:p>
             <w:pPr>
               <w:pStyle w:val="Compact"/>
-              <w:jc w:val="left"/>
             </w:pPr>
             <w:r>
               <w:t xml:space="preserve">Num.Obs.</w:t>
@@ -469,7 +444,6 @@
           <w:p>
             <w:pPr>
               <w:pStyle w:val="Compact"/>
-              <w:jc w:val="left"/>
             </w:pPr>
             <w:r>
               <w:t xml:space="preserve">342</w:t>
@@ -481,7 +455,6 @@
           <w:p>
             <w:pPr>
               <w:pStyle w:val="Compact"/>
-              <w:jc w:val="left"/>
             </w:pPr>
             <w:r>
               <w:t xml:space="preserve">342</w:t>
@@ -495,7 +468,6 @@
           <w:p>
             <w:pPr>
               <w:pStyle w:val="Compact"/>
-              <w:jc w:val="left"/>
             </w:pPr>
             <w:r>
               <w:t xml:space="preserve">R2</w:t>
@@ -507,7 +479,6 @@
           <w:p>
             <w:pPr>
               <w:pStyle w:val="Compact"/>
-              <w:jc w:val="left"/>
             </w:pPr>
             <w:r>
               <w:t xml:space="preserve">0.802</w:t>
@@ -519,7 +490,6 @@
           <w:p>
             <w:pPr>
               <w:pStyle w:val="Compact"/>
-              <w:jc w:val="left"/>
             </w:pPr>
             <w:r>
               <w:t xml:space="preserve">0.055</w:t>
@@ -533,7 +503,6 @@
           <w:p>
             <w:pPr>
               <w:pStyle w:val="Compact"/>
-              <w:jc w:val="left"/>
             </w:pPr>
             <w:r>
               <w:t xml:space="preserve">R2 Adj.</w:t>
@@ -545,7 +514,6 @@
           <w:p>
             <w:pPr>
               <w:pStyle w:val="Compact"/>
-              <w:jc w:val="left"/>
             </w:pPr>
             <w:r>
               <w:t xml:space="preserve">0.799</w:t>
@@ -557,7 +525,6 @@
           <w:p>
             <w:pPr>
               <w:pStyle w:val="Compact"/>
-              <w:jc w:val="left"/>
             </w:pPr>
             <w:r>
               <w:t xml:space="preserve">0.052</w:t>
@@ -571,7 +538,6 @@
           <w:p>
             <w:pPr>
               <w:pStyle w:val="Compact"/>
-              <w:jc w:val="left"/>
             </w:pPr>
             <w:r>
               <w:t xml:space="preserve">AIC</w:t>
@@ -583,7 +549,6 @@
           <w:p>
             <w:pPr>
               <w:pStyle w:val="Compact"/>
-              <w:jc w:val="left"/>
             </w:pPr>
             <w:r>
               <w:t xml:space="preserve">1589.9</w:t>
@@ -595,7 +560,6 @@
           <w:p>
             <w:pPr>
               <w:pStyle w:val="Compact"/>
-              <w:jc w:val="left"/>
             </w:pPr>
             <w:r>
               <w:t xml:space="preserve">2117.1</w:t>
@@ -609,7 +573,6 @@
           <w:p>
             <w:pPr>
               <w:pStyle w:val="Compact"/>
-              <w:jc w:val="left"/>
             </w:pPr>
             <w:r>
               <w:t xml:space="preserve">BIC</w:t>
@@ -621,7 +584,6 @@
           <w:p>
             <w:pPr>
               <w:pStyle w:val="Compact"/>
-              <w:jc w:val="left"/>
             </w:pPr>
             <w:r>
               <w:t xml:space="preserve">1616.8</w:t>
@@ -633,7 +595,6 @@
           <w:p>
             <w:pPr>
               <w:pStyle w:val="Compact"/>
-              <w:jc w:val="left"/>
             </w:pPr>
             <w:r>
               <w:t xml:space="preserve">2128.6</w:t>
@@ -647,7 +608,6 @@
           <w:p>
             <w:pPr>
               <w:pStyle w:val="Compact"/>
-              <w:jc w:val="left"/>
             </w:pPr>
             <w:r>
               <w:t xml:space="preserve">Log.Lik.</w:t>
@@ -659,7 +619,6 @@
           <w:p>
             <w:pPr>
               <w:pStyle w:val="Compact"/>
-              <w:jc w:val="left"/>
             </w:pPr>
             <w:r>
               <w:t xml:space="preserve">-787.967</w:t>
@@ -671,7 +630,6 @@
           <w:p>
             <w:pPr>
               <w:pStyle w:val="Compact"/>
-              <w:jc w:val="left"/>
             </w:pPr>
             <w:r>
               <w:t xml:space="preserve">-1055.559</w:t>
@@ -685,7 +643,6 @@
           <w:p>
             <w:pPr>
               <w:pStyle w:val="Compact"/>
-              <w:jc w:val="left"/>
             </w:pPr>
             <w:r>
               <w:t xml:space="preserve">F</w:t>
@@ -697,7 +654,6 @@
           <w:p>
             <w:pPr>
               <w:pStyle w:val="Compact"/>
-              <w:jc w:val="left"/>
             </w:pPr>
             <w:r>
               <w:t xml:space="preserve">272.946</w:t>
@@ -709,7 +665,6 @@
           <w:p>
             <w:pPr>
               <w:pStyle w:val="Compact"/>
-              <w:jc w:val="left"/>
             </w:pPr>
             <w:r>
               <w:t xml:space="preserve">19.884</w:t>
@@ -723,7 +678,6 @@
           <w:p>
             <w:pPr>
               <w:pStyle w:val="Compact"/>
-              <w:jc w:val="left"/>
             </w:pPr>
             <w:r>
               <w:t xml:space="preserve">RMSE</w:t>
@@ -735,7 +689,6 @@
           <w:p>
             <w:pPr>
               <w:pStyle w:val="Compact"/>
-              <w:jc w:val="left"/>
             </w:pPr>
             <w:r>
               <w:t xml:space="preserve">2.42</w:t>
@@ -747,7 +700,6 @@
           <w:p>
             <w:pPr>
               <w:pStyle w:val="Compact"/>
-              <w:jc w:val="left"/>
             </w:pPr>
             <w:r>
               <w:t xml:space="preserve">5.30</w:t>
@@ -756,7 +708,11 @@
         </w:tc>
       </w:tr>
     </w:tbl>
-    <w:sectPr/>
+    <w:sectPr>
+      <w:footnotePr>
+        <w:numRestart w:val="eachSect"/>
+      </w:footnotePr>
+    </w:sectPr>
   </w:body>
 </w:document>
 </file>
@@ -873,10 +829,10 @@
   <w:docDefaults>
     <w:rPrDefault>
       <w:rPr>
-        <w:rFonts w:asciiTheme="minorHAnsi" w:cstheme="minorBidi" w:eastAsiaTheme="minorHAnsi" w:hAnsiTheme="minorHAnsi"/>
+        <w:rFonts w:asciiTheme="minorHAnsi" w:cstheme="minorBidi" w:eastAsiaTheme="minorEastAsia" w:hAnsiTheme="minorHAnsi"/>
         <w:sz w:val="24"/>
         <w:szCs w:val="24"/>
-        <w:lang w:bidi="ar-SA" w:eastAsia="en-US" w:val="en-US"/>
+        <w:lang w:bidi="ar-SA" w:eastAsia="zh-CN" w:val="en-US"/>
       </w:rPr>
     </w:rPrDefault>
     <w:pPrDefault>
@@ -928,8 +884,6 @@
     </w:pPr>
     <w:rPr>
       <w:rFonts w:asciiTheme="majorHAnsi" w:cstheme="majorBidi" w:eastAsiaTheme="majorEastAsia" w:hAnsiTheme="majorHAnsi"/>
-      <w:spacing w:val="-10"/>
-      <w:kern w:val="28"/>
       <w:sz w:val="56"/>
       <w:szCs w:val="56"/>
     </w:rPr>
@@ -942,15 +896,13 @@
     <w:rsid w:val="00A10FD9"/>
     <w:rPr>
       <w:rFonts w:asciiTheme="majorHAnsi" w:cstheme="majorBidi" w:eastAsiaTheme="majorEastAsia" w:hAnsiTheme="majorHAnsi"/>
-      <w:spacing w:val="-10"/>
-      <w:kern w:val="28"/>
       <w:sz w:val="56"/>
       <w:szCs w:val="56"/>
     </w:rPr>
   </w:style>
   <w:style w:styleId="Subtitle" w:type="paragraph">
     <w:name w:val="Subtitle"/>
-    <w:basedOn w:val="Normal"/>
+    <w:basedOn w:val="Title"/>
     <w:next w:val="BodyText"/>
     <w:link w:val="SubtitleChar"/>
     <w:uiPriority w:val="11"/>
@@ -961,6 +913,19 @@
         <w:ilvl w:val="1"/>
       </w:numPr>
     </w:pPr>
+    <w:rPr>
+      <w:rFonts w:cstheme="majorBidi" w:eastAsiaTheme="majorEastAsia"/>
+      <w:spacing w:val="15"/>
+      <w:sz w:val="28"/>
+      <w:szCs w:val="28"/>
+    </w:rPr>
+  </w:style>
+  <w:style w:customStyle="1" w:styleId="SubtitleChar" w:type="character">
+    <w:name w:val="Subtitle Char"/>
+    <w:basedOn w:val="DefaultParagraphFont"/>
+    <w:link w:val="Subtitle"/>
+    <w:uiPriority w:val="11"/>
+    <w:rsid w:val="00A10FD9"/>
     <w:rPr>
       <w:rFonts w:cstheme="majorBidi" w:eastAsiaTheme="majorEastAsia"/>
       <w:color w:themeColor="text1" w:themeTint="A6" w:val="595959"/>
@@ -969,39 +934,33 @@
       <w:szCs w:val="28"/>
     </w:rPr>
   </w:style>
-  <w:style w:customStyle="1" w:styleId="SubtitleChar" w:type="character">
-    <w:name w:val="Subtitle Char"/>
-    <w:basedOn w:val="DefaultParagraphFont"/>
-    <w:link w:val="Subtitle"/>
-    <w:uiPriority w:val="11"/>
-    <w:rsid w:val="00A10FD9"/>
-    <w:rPr>
-      <w:rFonts w:cstheme="majorBidi" w:eastAsiaTheme="majorEastAsia"/>
-      <w:color w:themeColor="text1" w:themeTint="A6" w:val="595959"/>
-      <w:spacing w:val="15"/>
-      <w:sz w:val="28"/>
-      <w:szCs w:val="28"/>
-    </w:rPr>
-  </w:style>
   <w:style w:customStyle="1" w:styleId="Author" w:type="paragraph">
     <w:name w:val="Author"/>
+    <w:basedOn w:val="Title"/>
     <w:next w:val="BodyText"/>
     <w:qFormat/>
     <w:pPr>
       <w:keepNext/>
       <w:keepLines/>
-      <w:jc w:val="center"/>
-    </w:pPr>
+    </w:pPr>
+    <w:rPr>
+      <w:sz w:val="24"/>
+      <w:szCs w:val="24"/>
+    </w:rPr>
   </w:style>
   <w:style w:styleId="Date" w:type="paragraph">
     <w:name w:val="Date"/>
+    <w:basedOn w:val="Title"/>
     <w:next w:val="BodyText"/>
     <w:qFormat/>
     <w:pPr>
       <w:keepNext/>
       <w:keepLines/>
-      <w:jc w:val="center"/>
-    </w:pPr>
+    </w:pPr>
+    <w:rPr>
+      <w:sz w:val="24"/>
+      <w:szCs w:val="24"/>
+    </w:rPr>
   </w:style>
   <w:style w:customStyle="1" w:styleId="AbstractTitle" w:type="paragraph">
     <w:name w:val="Abstract Title"/>
@@ -1016,7 +975,6 @@
     </w:pPr>
     <w:rPr>
       <w:b/>
-      <w:color w:val="345A8A"/>
       <w:sz w:val="20"/>
       <w:szCs w:val="20"/>
     </w:rPr>
@@ -1415,13 +1373,6 @@
       </w:tblCellMar>
     </w:tblPr>
     <w:tblStylePr w:type="firstRow">
-      <w:tblPr>
-        <w:jc w:val="left"/>
-        <w:tblInd w:type="dxa" w:w="0"/>
-      </w:tblPr>
-      <w:trPr>
-        <w:jc w:val="left"/>
-      </w:trPr>
       <w:tcPr>
         <w:tcBorders>
           <w:bottom w:val="single"/>

</xml_diff>